<commit_message>
Refine BeOne gSMA resume wording
</commit_message>
<xml_diff>
--- a/output/cv-alanis-sun-beone-global-study-management-associate-gsma-r36070-2026-09-30.docx
+++ b/output/cv-alanis-sun-beone-global-study-management-associate-gsma-r36070-2026-09-30.docx
@@ -208,7 +208,7 @@
         <w:t>Clinical Trial REDCap Simulation:</w:t>
       </w:r>
       <w:r>
-        <w:t xml:space="preserve"> Designed a mock Phase I EDC with longitudinal CRFs, visit/event mapping, sample traceability, and data-quality controls.</w:t>
+        <w:t xml:space="preserve"> Designed a simulated Phase I EDC with longitudinal CRFs, visit/event mapping, sample traceability, and data-quality controls.</w:t>
       </w:r>
     </w:p>
     <w:p>
@@ -230,7 +230,7 @@
         <w:t>M.S., Biomedical Science, Physiology &amp; Pharmacology</w:t>
       </w:r>
       <w:r>
-        <w:t xml:space="preserve"> - Chang Gung University | 2017-2018; academic oncology/MDR research (not clinical-trial experience)</w:t>
+        <w:t xml:space="preserve"> - Chang Gung University | 2017-2018; academic oncology research involving multidrug resistance (MDR) and drug screening</w:t>
       </w:r>
     </w:p>
     <w:p>

</xml_diff>